<commit_message>
se hicieron mejoras en oficios
</commit_message>
<xml_diff>
--- a/plantillas/oficio_camaras.docx
+++ b/plantillas/oficio_camaras.docx
@@ -372,7 +372,7 @@
           <w:color w:val="000000" w:themeColor="text1"/>
           <w:lang w:val="es-ES"/>
         </w:rPr>
-        <w:t>C</w:t>
+        <w:t>${oficio_asunto}</w:t>
       </w:r>
       <w:r>
         <w:rPr>
@@ -380,7 +380,7 @@
           <w:color w:val="000000" w:themeColor="text1"/>
           <w:lang w:val="es-ES"/>
         </w:rPr>
-        <w:t xml:space="preserve">opia de “Vídeo Fílmico”, de </w:t>
+        <w:t xml:space="preserve"/>
       </w:r>
       <w:r>
         <w:rPr>
@@ -390,7 +390,7 @@
           <w:color w:val="000000" w:themeColor="text1"/>
           <w:lang w:val="es-ES"/>
         </w:rPr>
-        <w:t>${</w:t>
+        <w:t/>
       </w:r>
       <w:r>
         <w:rPr>
@@ -400,7 +400,7 @@
           <w:color w:val="000000" w:themeColor="text1"/>
           <w:lang w:val="es-ES"/>
         </w:rPr>
-        <w:t>oficio_rango_desde</w:t>
+        <w:t/>
       </w:r>
       <w:r>
         <w:rPr>
@@ -410,7 +410,7 @@
           <w:color w:val="000000" w:themeColor="text1"/>
           <w:lang w:val="es-ES"/>
         </w:rPr>
-        <w:t>}</w:t>
+        <w:t/>
       </w:r>
       <w:r>
         <w:rPr>
@@ -420,7 +420,7 @@
           <w:color w:val="000000" w:themeColor="text1"/>
           <w:lang w:val="es-ES"/>
         </w:rPr>
-        <w:t xml:space="preserve"> a </w:t>
+        <w:t xml:space="preserve"/>
       </w:r>
       <w:r>
         <w:rPr>
@@ -430,7 +430,7 @@
           <w:color w:val="000000" w:themeColor="text1"/>
           <w:lang w:val="es-ES"/>
         </w:rPr>
-        <w:t>${</w:t>
+        <w:t/>
       </w:r>
       <w:r>
         <w:rPr>
@@ -440,7 +440,7 @@
           <w:color w:val="000000" w:themeColor="text1"/>
           <w:lang w:val="es-ES"/>
         </w:rPr>
-        <w:t>oficio_rango_hasta</w:t>
+        <w:t/>
       </w:r>
       <w:r>
         <w:rPr>
@@ -450,7 +450,7 @@
           <w:color w:val="000000" w:themeColor="text1"/>
           <w:lang w:val="es-ES"/>
         </w:rPr>
-        <w:t>}</w:t>
+        <w:t/>
       </w:r>
       <w:r>
         <w:rPr>
@@ -460,7 +460,7 @@
           <w:color w:val="000000" w:themeColor="text1"/>
           <w:lang w:val="es-ES"/>
         </w:rPr>
-        <w:t xml:space="preserve"> </w:t>
+        <w:t xml:space="preserve"/>
       </w:r>
       <w:r>
         <w:rPr>
@@ -468,7 +468,7 @@
           <w:color w:val="000000" w:themeColor="text1"/>
           <w:lang w:val="es-ES"/>
         </w:rPr>
-        <w:t>h</w:t>
+        <w:t/>
       </w:r>
       <w:r>
         <w:rPr>
@@ -476,7 +476,7 @@
           <w:color w:val="000000" w:themeColor="text1"/>
           <w:lang w:val="es-ES"/>
         </w:rPr>
-        <w:t>oras</w:t>
+        <w:t/>
       </w:r>
       <w:r>
         <w:rPr>
@@ -484,7 +484,7 @@
           <w:color w:val="000000" w:themeColor="text1"/>
           <w:lang w:val="es-ES"/>
         </w:rPr>
-        <w:t>, del día</w:t>
+        <w:t/>
       </w:r>
       <w:r>
         <w:rPr>
@@ -492,7 +492,7 @@
           <w:bCs/>
           <w:color w:val="000000" w:themeColor="text1"/>
         </w:rPr>
-        <w:t xml:space="preserve"> </w:t>
+        <w:t xml:space="preserve"/>
       </w:r>
       <w:r>
         <w:rPr>
@@ -500,7 +500,7 @@
           <w:bCs/>
           <w:color w:val="000000" w:themeColor="text1"/>
         </w:rPr>
-        <w:t>${accidente_fecha_abrev}</w:t>
+        <w:t/>
       </w:r>
       <w:r>
         <w:rPr>
@@ -508,7 +508,7 @@
           <w:color w:val="000000" w:themeColor="text1"/>
           <w:lang w:val="es-ES"/>
         </w:rPr>
-        <w:t>, por motivo que se indica.</w:t>
+        <w:t/>
       </w:r>
       <w:r>
         <w:rPr>
@@ -516,7 +516,7 @@
           <w:color w:val="000000" w:themeColor="text1"/>
           <w:lang w:val="es-ES"/>
         </w:rPr>
-        <w:t xml:space="preserve"> </w:t>
+        <w:t xml:space="preserve"/>
       </w:r>
       <w:r>
         <w:rPr>
@@ -527,7 +527,7 @@
           <w:u w:val="single"/>
           <w:lang w:val="es-ES"/>
         </w:rPr>
-        <w:t>SOLICITA</w:t>
+        <w:t/>
       </w:r>
     </w:p>
     <w:p>

</xml_diff>